<commit_message>
feat: enhance arc reactor with hexagonal design and add parallax scrolling
- Redesigned Arc Reactor with authentic hexagonal core inspired by Tony Stark
- Added rotating conic gradient outer glow and multi-layered hexagon structure
- Increased icon sizes (sm: 24px, md: 32px, lg: 40px) for better visibility
- Fixed label positioning (FRONTEND at top, BACKEND at right, AI & TOOLS at bottom)
- Added 50 energy particles with smooth GPU-accelerated animations
- Installed and integrated react-scroll-parallax for smooth scrolling effects
- Added parallax to all sections (Hero, About, Experience, Projects, Contact)
- Optimized performance with willChange CSS hints
- Larger arc reactor core (160px) with pulsing white center dot
</commit_message>
<xml_diff>
--- a/GauravAmolGuddeti_CSE-AIML_Updated.docx
+++ b/GauravAmolGuddeti_CSE-AIML_Updated.docx
@@ -19,15 +19,7 @@
         <w:jc w:val="center"/>
       </w:pPr>
       <w:r>
-        <w:t xml:space="preserve">📞 </w:t>
-      </w:r>
-      <w:proofErr w:type="gramStart"/>
-      <w:r>
-        <w:t>7276082005  |</w:t>
-      </w:r>
-      <w:proofErr w:type="gramEnd"/>
-      <w:r>
-        <w:t xml:space="preserve">  📧 guddetigaurav1@gmail.com</w:t>
+        <w:t>📞 7276082005  |  📧 guddetigaurav1@gmail.com</w:t>
       </w:r>
       <w:r>
         <w:br/>
@@ -203,7 +195,39 @@
           <w:iCs/>
           <w:lang w:val="en-IN"/>
         </w:rPr>
-        <w:t>(2025 – Present)</w:t>
+        <w:t>(</w:t>
+      </w:r>
+      <w:r>
+        <w:rPr>
+          <w:i/>
+          <w:iCs/>
+          <w:lang w:val="en-IN"/>
+        </w:rPr>
+        <w:t xml:space="preserve">July 15 </w:t>
+      </w:r>
+      <w:r>
+        <w:rPr>
+          <w:i/>
+          <w:iCs/>
+          <w:lang w:val="en-IN"/>
+        </w:rPr>
+        <w:t xml:space="preserve">2025 – </w:t>
+      </w:r>
+      <w:r>
+        <w:rPr>
+          <w:i/>
+          <w:iCs/>
+          <w:lang w:val="en-IN"/>
+        </w:rPr>
+        <w:t>26 October 2025</w:t>
+      </w:r>
+      <w:r>
+        <w:rPr>
+          <w:i/>
+          <w:iCs/>
+          <w:lang w:val="en-IN"/>
+        </w:rPr>
+        <w:t>)</w:t>
       </w:r>
       <w:r>
         <w:rPr>
@@ -219,6 +243,56 @@
           <w:ilvl w:val="0"/>
           <w:numId w:val="10"/>
         </w:numPr>
+        <w:tabs>
+          <w:tab w:val="clear" w:pos="720"/>
+          <w:tab w:val="num" w:pos="1080"/>
+        </w:tabs>
+        <w:spacing w:after="80"/>
+        <w:rPr>
+          <w:lang w:val="en-IN"/>
+        </w:rPr>
+      </w:pPr>
+      <w:r>
+        <w:t xml:space="preserve">Building an </w:t>
+      </w:r>
+      <w:r>
+        <w:rPr>
+          <w:rStyle w:val="Strong"/>
+        </w:rPr>
+        <w:t>AI-driven IVR (Interactive Voice Response) system</w:t>
+      </w:r>
+      <w:r>
+        <w:t xml:space="preserve"> leveraging </w:t>
+      </w:r>
+      <w:r>
+        <w:rPr>
+          <w:rStyle w:val="Strong"/>
+        </w:rPr>
+        <w:t>Retrieval-Augmented Generation (RAG)</w:t>
+      </w:r>
+      <w:r>
+        <w:t xml:space="preserve"> and </w:t>
+      </w:r>
+      <w:r>
+        <w:rPr>
+          <w:rStyle w:val="Strong"/>
+        </w:rPr>
+        <w:t>LangGraph</w:t>
+      </w:r>
+      <w:r>
+        <w:t xml:space="preserve"> for intelligent query handling.</w:t>
+      </w:r>
+    </w:p>
+    <w:p>
+      <w:pPr>
+        <w:numPr>
+          <w:ilvl w:val="0"/>
+          <w:numId w:val="10"/>
+        </w:numPr>
+        <w:tabs>
+          <w:tab w:val="clear" w:pos="720"/>
+          <w:tab w:val="num" w:pos="1080"/>
+        </w:tabs>
         <w:spacing w:after="80"/>
         <w:rPr>
           <w:lang w:val="en-IN"/>
@@ -237,6 +311,10 @@
           <w:ilvl w:val="0"/>
           <w:numId w:val="10"/>
         </w:numPr>
+        <w:tabs>
+          <w:tab w:val="clear" w:pos="720"/>
+          <w:tab w:val="num" w:pos="1080"/>
+        </w:tabs>
         <w:spacing w:after="80"/>
         <w:rPr>
           <w:lang w:val="en-IN"/>
@@ -255,6 +333,10 @@
           <w:ilvl w:val="0"/>
           <w:numId w:val="10"/>
         </w:numPr>
+        <w:tabs>
+          <w:tab w:val="clear" w:pos="720"/>
+          <w:tab w:val="num" w:pos="1080"/>
+        </w:tabs>
         <w:spacing w:after="80"/>
         <w:rPr>
           <w:lang w:val="en-IN"/>
@@ -269,6 +351,38 @@
     </w:p>
     <w:p>
       <w:pPr>
+        <w:spacing w:after="80"/>
+        <w:rPr>
+          <w:lang w:val="en-IN"/>
+        </w:rPr>
+      </w:pPr>
+    </w:p>
+    <w:p>
+      <w:pPr>
+        <w:spacing w:after="80"/>
+        <w:rPr>
+          <w:lang w:val="en-IN"/>
+        </w:rPr>
+      </w:pPr>
+    </w:p>
+    <w:p>
+      <w:pPr>
+        <w:spacing w:after="80"/>
+        <w:rPr>
+          <w:lang w:val="en-IN"/>
+        </w:rPr>
+      </w:pPr>
+    </w:p>
+    <w:p>
+      <w:pPr>
+        <w:spacing w:after="80"/>
+        <w:rPr>
+          <w:lang w:val="en-IN"/>
+        </w:rPr>
+      </w:pPr>
+    </w:p>
+    <w:p>
+      <w:pPr>
         <w:spacing w:before="240" w:after="80"/>
       </w:pPr>
       <w:r>
@@ -276,15 +390,158 @@
           <w:b/>
           <w:sz w:val="24"/>
         </w:rPr>
+        <w:lastRenderedPageBreak/>
         <w:t>Projects</w:t>
       </w:r>
     </w:p>
     <w:p>
       <w:pPr>
         <w:pStyle w:val="ListBullet"/>
+        <w:tabs>
+          <w:tab w:val="clear" w:pos="360"/>
+          <w:tab w:val="num" w:pos="720"/>
+        </w:tabs>
+      </w:pPr>
+      <w:r>
+        <w:t>ASLVision – Real-time Sign Language Recognition System</w:t>
+      </w:r>
+    </w:p>
+    <w:p>
+      <w:pPr>
+        <w:pStyle w:val="ListBullet"/>
+        <w:numPr>
+          <w:ilvl w:val="0"/>
+          <w:numId w:val="0"/>
+        </w:numPr>
+        <w:ind w:left="360"/>
+      </w:pPr>
+      <w:r>
+        <w:t>A cutting-edge real-time American Sign Language (ASL) recognition system that translates ASL fingerspelling into text using deep learning and computer vision. Recognized as one of the most accurate open-source ASL recognition systems available.</w:t>
+      </w:r>
+    </w:p>
+    <w:p>
+      <w:pPr>
+        <w:pStyle w:val="ListBullet"/>
+        <w:tabs>
+          <w:tab w:val="clear" w:pos="360"/>
+          <w:tab w:val="num" w:pos="720"/>
+        </w:tabs>
+      </w:pPr>
+      <w:r>
+        <w:t>Key Achievements:</w:t>
+      </w:r>
+    </w:p>
+    <w:p>
+      <w:pPr>
+        <w:pStyle w:val="ListBullet"/>
+        <w:numPr>
+          <w:ilvl w:val="0"/>
+          <w:numId w:val="12"/>
+        </w:numPr>
+      </w:pPr>
+      <w:r>
+        <w:t>Achieved 99.97% test accuracy on ASL alphabet recognition (A-Z + space + delete)</w:t>
+      </w:r>
+    </w:p>
+    <w:p>
+      <w:pPr>
+        <w:pStyle w:val="ListBullet"/>
+        <w:numPr>
+          <w:ilvl w:val="0"/>
+          <w:numId w:val="12"/>
+        </w:numPr>
+      </w:pPr>
+      <w:r>
+        <w:t>Real-time processing at ~30 FPS on GPU with intelligent preprocessing pipeline</w:t>
+      </w:r>
+    </w:p>
+    <w:p>
+      <w:pPr>
+        <w:pStyle w:val="ListBullet"/>
+        <w:numPr>
+          <w:ilvl w:val="0"/>
+          <w:numId w:val="12"/>
+        </w:numPr>
+      </w:pPr>
+      <w:r>
+        <w:t>Enhanced CNN architecture with batch normalization and dropout for robust performance</w:t>
+      </w:r>
+    </w:p>
+    <w:p>
+      <w:pPr>
+        <w:pStyle w:val="ListBullet"/>
+        <w:numPr>
+          <w:ilvl w:val="0"/>
+          <w:numId w:val="12"/>
+        </w:numPr>
+      </w:pPr>
+      <w:r>
+        <w:t>Comprehensive research-grade evaluation with confusion matrices and ablation studies</w:t>
+      </w:r>
+    </w:p>
+    <w:p>
+      <w:pPr>
+        <w:pStyle w:val="ListBullet"/>
+        <w:numPr>
+          <w:ilvl w:val="0"/>
+          <w:numId w:val="12"/>
+        </w:numPr>
+      </w:pPr>
+      <w:r>
+        <w:t>Tech Stack: Python, PyTorch, OpenCV, MediaPipe, NumPy, tkinter</w:t>
+      </w:r>
+    </w:p>
+    <w:p>
+      <w:pPr>
+        <w:pStyle w:val="ListBullet"/>
+        <w:tabs>
+          <w:tab w:val="clear" w:pos="360"/>
+          <w:tab w:val="num" w:pos="720"/>
+        </w:tabs>
+        <w:ind w:left="720"/>
+        <w:rPr>
+          <w:b/>
+          <w:bCs/>
+        </w:rPr>
+      </w:pPr>
+      <w:r>
+        <w:rPr>
+          <w:b/>
+          <w:bCs/>
+        </w:rPr>
+        <w:t xml:space="preserve">GitHub: </w:t>
+      </w:r>
+      <w:hyperlink r:id="rId6" w:history="1">
+        <w:r>
+          <w:rPr>
+            <w:rStyle w:val="Hyperlink"/>
+            <w:b/>
+            <w:bCs/>
+          </w:rPr>
+          <w:t>https://github.com/Gauravguddeti/ASLVision</w:t>
+        </w:r>
+      </w:hyperlink>
+    </w:p>
+    <w:p>
+      <w:pPr>
+        <w:pStyle w:val="ListBullet"/>
+        <w:numPr>
+          <w:ilvl w:val="0"/>
+          <w:numId w:val="0"/>
+        </w:numPr>
         <w:spacing w:after="40"/>
       </w:pPr>
+    </w:p>
+    <w:p>
+      <w:pPr>
+        <w:pStyle w:val="ListBullet"/>
+        <w:spacing w:after="40"/>
+      </w:pPr>
       <w:r>
+        <w:rPr>
+          <w:b/>
+          <w:bCs/>
+        </w:rPr>
         <w:t>SmartJeb – AI-powered Expense Tracker</w:t>
       </w:r>
       <w:r>
@@ -297,16 +554,89 @@
       </w:r>
       <w:r>
         <w:br/>
-        <w:t>GitHub: https://github.com/Gauravguddeti/SmartJeb | Demo: https://smartjeb.vercel.app</w:t>
+      </w:r>
+      <w:r>
+        <w:rPr>
+          <w:b/>
+          <w:bCs/>
+        </w:rPr>
+        <w:t xml:space="preserve">GitHub: </w:t>
+      </w:r>
+      <w:hyperlink r:id="rId7" w:history="1">
+        <w:r>
+          <w:rPr>
+            <w:rStyle w:val="Hyperlink"/>
+            <w:b/>
+            <w:bCs/>
+          </w:rPr>
+          <w:t>https://github.com/Gauravguddeti/SmartJeb</w:t>
+        </w:r>
+      </w:hyperlink>
+      <w:r>
+        <w:t xml:space="preserve"> </w:t>
       </w:r>
     </w:p>
     <w:p>
       <w:pPr>
         <w:pStyle w:val="ListBullet"/>
+        <w:numPr>
+          <w:ilvl w:val="0"/>
+          <w:numId w:val="0"/>
+        </w:numPr>
         <w:spacing w:after="40"/>
+        <w:ind w:left="360"/>
+        <w:rPr>
+          <w:b/>
+          <w:bCs/>
+        </w:rPr>
       </w:pPr>
       <w:r>
-        <w:lastRenderedPageBreak/>
+        <w:rPr>
+          <w:b/>
+          <w:bCs/>
+        </w:rPr>
+        <w:t xml:space="preserve">Demo: </w:t>
+      </w:r>
+      <w:hyperlink r:id="rId8" w:history="1">
+        <w:r>
+          <w:rPr>
+            <w:rStyle w:val="Hyperlink"/>
+            <w:b/>
+            <w:bCs/>
+          </w:rPr>
+          <w:t>https://smartjeb.vercel.app</w:t>
+        </w:r>
+      </w:hyperlink>
+    </w:p>
+    <w:p>
+      <w:pPr>
+        <w:pStyle w:val="ListBullet"/>
+        <w:numPr>
+          <w:ilvl w:val="0"/>
+          <w:numId w:val="0"/>
+        </w:numPr>
+        <w:spacing w:after="40"/>
+        <w:ind w:left="360"/>
+        <w:rPr>
+          <w:b/>
+          <w:bCs/>
+        </w:rPr>
+      </w:pPr>
+    </w:p>
+    <w:p>
+      <w:pPr>
+        <w:pStyle w:val="ListBullet"/>
+        <w:spacing w:after="40"/>
+        <w:rPr>
+          <w:b/>
+          <w:bCs/>
+        </w:rPr>
+      </w:pPr>
+      <w:r>
+        <w:rPr>
+          <w:b/>
+          <w:bCs/>
+        </w:rPr>
         <w:t>Crop Disease Analyzer – AI for Agriculture</w:t>
       </w:r>
       <w:r>
@@ -319,16 +649,84 @@
       </w:r>
       <w:r>
         <w:br/>
-        <w:t>GitHub: https://github.com/Gauravguddeti/CropDiseaseDetector | Demo: https://cropdiseaseanalyzer.vercel.app</w:t>
       </w:r>
+      <w:r>
+        <w:rPr>
+          <w:b/>
+          <w:bCs/>
+        </w:rPr>
+        <w:t xml:space="preserve">GitHub: </w:t>
+      </w:r>
+      <w:hyperlink r:id="rId9" w:history="1">
+        <w:r>
+          <w:rPr>
+            <w:rStyle w:val="Hyperlink"/>
+            <w:b/>
+            <w:bCs/>
+          </w:rPr>
+          <w:t>https://github.com/Gauravguddeti/CropDiseaseDetector</w:t>
+        </w:r>
+      </w:hyperlink>
     </w:p>
     <w:p>
       <w:pPr>
         <w:pStyle w:val="ListBullet"/>
+        <w:numPr>
+          <w:ilvl w:val="0"/>
+          <w:numId w:val="0"/>
+        </w:numPr>
         <w:spacing w:after="40"/>
+        <w:ind w:left="360"/>
+        <w:rPr>
+          <w:b/>
+          <w:bCs/>
+        </w:rPr>
       </w:pPr>
       <w:r>
-        <w:t xml:space="preserve">Deblurryfy – Image Deblurring Tool </w:t>
+        <w:rPr>
+          <w:b/>
+          <w:bCs/>
+        </w:rPr>
+        <w:t xml:space="preserve">Demo: </w:t>
+      </w:r>
+      <w:hyperlink r:id="rId10" w:history="1">
+        <w:r>
+          <w:rPr>
+            <w:rStyle w:val="Hyperlink"/>
+            <w:b/>
+            <w:bCs/>
+          </w:rPr>
+          <w:t>https://cropdiseaseanalyzer.vercel.app</w:t>
+        </w:r>
+      </w:hyperlink>
+    </w:p>
+    <w:p>
+      <w:pPr>
+        <w:pStyle w:val="ListBullet"/>
+        <w:numPr>
+          <w:ilvl w:val="0"/>
+          <w:numId w:val="0"/>
+        </w:numPr>
+        <w:spacing w:after="40"/>
+        <w:rPr>
+          <w:b/>
+          <w:bCs/>
+        </w:rPr>
+      </w:pPr>
+    </w:p>
+    <w:p>
+      <w:pPr>
+        <w:pStyle w:val="ListBullet"/>
+      </w:pPr>
+      <w:r>
+        <w:rPr>
+          <w:b/>
+          <w:bCs/>
+        </w:rPr>
+        <w:t>Deblurryfy – Image Deblurring Tool</w:t>
+      </w:r>
+      <w:r>
+        <w:t xml:space="preserve"> </w:t>
       </w:r>
       <w:r>
         <w:br/>
@@ -340,16 +738,58 @@
       </w:r>
       <w:r>
         <w:br/>
-        <w:t>GitHub: https://github.com/Gauravguddeti/deblurryfy</w:t>
       </w:r>
+      <w:r>
+        <w:rPr>
+          <w:b/>
+          <w:bCs/>
+        </w:rPr>
+        <w:t xml:space="preserve">GitHub: </w:t>
+      </w:r>
+      <w:hyperlink r:id="rId11" w:history="1">
+        <w:r>
+          <w:rPr>
+            <w:rStyle w:val="Hyperlink"/>
+            <w:b/>
+            <w:bCs/>
+          </w:rPr>
+          <w:t>https://github.com/Gauravguddeti/deblurryfy</w:t>
+        </w:r>
+      </w:hyperlink>
     </w:p>
     <w:p>
       <w:pPr>
         <w:pStyle w:val="ListBullet"/>
-        <w:spacing w:after="40"/>
+        <w:numPr>
+          <w:ilvl w:val="0"/>
+          <w:numId w:val="0"/>
+        </w:numPr>
+        <w:ind w:left="360"/>
+      </w:pPr>
+    </w:p>
+    <w:p>
+      <w:pPr>
+        <w:pStyle w:val="ListBullet"/>
+        <w:tabs>
+          <w:tab w:val="clear" w:pos="360"/>
+          <w:tab w:val="num" w:pos="0"/>
+          <w:tab w:val="num" w:pos="1897"/>
+        </w:tabs>
+        <w:rPr>
+          <w:rStyle w:val="Hyperlink"/>
+          <w:color w:val="auto"/>
+          <w:u w:val="none"/>
+        </w:rPr>
       </w:pPr>
       <w:r>
-        <w:t xml:space="preserve">Smart Traffic Signal System </w:t>
+        <w:rPr>
+          <w:b/>
+          <w:bCs/>
+        </w:rPr>
+        <w:t>Smart Traffic Signal System</w:t>
+      </w:r>
+      <w:r>
+        <w:t xml:space="preserve"> </w:t>
       </w:r>
       <w:r>
         <w:br/>
@@ -363,7 +803,7 @@
         <w:br/>
         <w:t xml:space="preserve">GitHub: </w:t>
       </w:r>
-      <w:hyperlink r:id="rId6" w:history="1">
+      <w:hyperlink r:id="rId12" w:history="1">
         <w:r>
           <w:rPr>
             <w:rStyle w:val="Hyperlink"/>
@@ -375,9 +815,29 @@
     <w:p>
       <w:pPr>
         <w:pStyle w:val="ListBullet"/>
+        <w:numPr>
+          <w:ilvl w:val="0"/>
+          <w:numId w:val="0"/>
+        </w:numPr>
+        <w:tabs>
+          <w:tab w:val="num" w:pos="1897"/>
+        </w:tabs>
+      </w:pPr>
+    </w:p>
+    <w:p>
+      <w:pPr>
+        <w:pStyle w:val="ListBullet"/>
         <w:spacing w:after="40"/>
+        <w:rPr>
+          <w:b/>
+          <w:bCs/>
+        </w:rPr>
       </w:pPr>
       <w:r>
+        <w:rPr>
+          <w:b/>
+          <w:bCs/>
+        </w:rPr>
         <w:t>Jarvis ai</w:t>
       </w:r>
     </w:p>
@@ -412,34 +872,12 @@
         <w:ind w:left="360" w:hanging="360"/>
       </w:pPr>
       <w:r>
+        <w:lastRenderedPageBreak/>
         <w:tab/>
-      </w:r>
-      <w:proofErr w:type="gramStart"/>
-      <w:r>
-        <w:t>Tech  Stack</w:t>
-      </w:r>
-      <w:proofErr w:type="gramEnd"/>
-      <w:r>
-        <w:t xml:space="preserve">: </w:t>
+        <w:t xml:space="preserve">Tech  Stack: </w:t>
       </w:r>
       <w:r>
-        <w:t xml:space="preserve">Python 3.8+ | </w:t>
-      </w:r>
-      <w:proofErr w:type="spellStart"/>
-      <w:r>
-        <w:t>Ollama</w:t>
-      </w:r>
-      <w:proofErr w:type="spellEnd"/>
-      <w:r>
-        <w:t xml:space="preserve"> | Mistral 7B | Stable Diffusion | HTML/CSS/JS | Eel | </w:t>
-      </w:r>
-      <w:proofErr w:type="spellStart"/>
-      <w:r>
-        <w:t>PyTorch</w:t>
-      </w:r>
-      <w:proofErr w:type="spellEnd"/>
-      <w:r>
-        <w:t xml:space="preserve"> | Transformers</w:t>
+        <w:t>Python 3.8+ | Ollama | Mistral 7B | Stable Diffusion | HTML/CSS/JS | Eel | PyTorch | Transformers</w:t>
       </w:r>
     </w:p>
     <w:p>
@@ -451,20 +889,39 @@
         </w:numPr>
         <w:spacing w:after="40"/>
         <w:ind w:left="360"/>
+        <w:rPr>
+          <w:b/>
+          <w:bCs/>
+        </w:rPr>
       </w:pPr>
       <w:r>
+        <w:rPr>
+          <w:b/>
+          <w:bCs/>
+        </w:rPr>
         <w:t xml:space="preserve">GitHub: </w:t>
       </w:r>
-      <w:r>
-        <w:t>https://github.com/Gauravguddeti/jarvis</w:t>
-      </w:r>
+      <w:hyperlink r:id="rId13" w:history="1">
+        <w:r>
+          <w:rPr>
+            <w:rStyle w:val="Hyperlink"/>
+            <w:b/>
+            <w:bCs/>
+          </w:rPr>
+          <w:t>https://github.com/Gauravguddeti/jarvis</w:t>
+        </w:r>
+      </w:hyperlink>
     </w:p>
     <w:p>
       <w:pPr>
         <w:spacing w:before="240" w:after="80"/>
+        <w:rPr>
+          <w:rFonts w:asciiTheme="majorHAnsi" w:hAnsiTheme="majorHAnsi" w:cstheme="majorHAnsi"/>
+        </w:rPr>
       </w:pPr>
       <w:r>
         <w:rPr>
+          <w:rFonts w:asciiTheme="majorHAnsi" w:hAnsiTheme="majorHAnsi" w:cstheme="majorHAnsi"/>
           <w:b/>
           <w:sz w:val="24"/>
         </w:rPr>
@@ -473,49 +930,345 @@
     </w:p>
     <w:p>
       <w:pPr>
-        <w:pStyle w:val="ListBullet"/>
-        <w:spacing w:after="40"/>
+        <w:pStyle w:val="NormalWeb"/>
+        <w:spacing w:before="0" w:beforeAutospacing="0"/>
+        <w:rPr>
+          <w:rFonts w:asciiTheme="majorHAnsi" w:hAnsiTheme="majorHAnsi" w:cstheme="majorHAnsi"/>
+          <w:i/>
+          <w:iCs/>
+        </w:rPr>
       </w:pPr>
       <w:r>
-        <w:t>The Complete Python Bootcamp: From Zero to Hero – Udemy, 2023</w:t>
+        <w:rPr>
+          <w:rFonts w:asciiTheme="majorHAnsi" w:hAnsiTheme="majorHAnsi" w:cstheme="majorHAnsi"/>
+          <w:i/>
+          <w:iCs/>
+        </w:rPr>
+        <w:t>1.</w:t>
+      </w:r>
+      <w:r>
+        <w:rPr>
+          <w:rFonts w:asciiTheme="majorHAnsi" w:hAnsiTheme="majorHAnsi" w:cstheme="majorHAnsi"/>
+          <w:i/>
+          <w:iCs/>
+        </w:rPr>
+        <w:t xml:space="preserve">  </w:t>
+      </w:r>
+      <w:r>
+        <w:rPr>
+          <w:rStyle w:val="Emphasis"/>
+          <w:rFonts w:asciiTheme="majorHAnsi" w:hAnsiTheme="majorHAnsi" w:cstheme="majorHAnsi"/>
+          <w:b/>
+          <w:bCs/>
+          <w:i w:val="0"/>
+          <w:iCs w:val="0"/>
+        </w:rPr>
+        <w:t>Generative AI Fundamentals</w:t>
+      </w:r>
+      <w:r>
+        <w:rPr>
+          <w:rFonts w:asciiTheme="majorHAnsi" w:hAnsiTheme="majorHAnsi" w:cstheme="majorHAnsi"/>
+          <w:i/>
+          <w:iCs/>
+        </w:rPr>
+        <w:t xml:space="preserve"> – Google, 2023</w:t>
       </w:r>
     </w:p>
     <w:p>
       <w:pPr>
-        <w:pStyle w:val="ListBullet"/>
-        <w:spacing w:after="40"/>
+        <w:pStyle w:val="NormalWeb"/>
+        <w:spacing w:before="0" w:beforeAutospacing="0"/>
+        <w:rPr>
+          <w:rFonts w:asciiTheme="majorHAnsi" w:hAnsiTheme="majorHAnsi" w:cstheme="majorHAnsi"/>
+          <w:i/>
+          <w:iCs/>
+        </w:rPr>
       </w:pPr>
       <w:r>
-        <w:t>Generative AI Fundamentals – Google, 2023</w:t>
+        <w:rPr>
+          <w:rFonts w:asciiTheme="majorHAnsi" w:hAnsiTheme="majorHAnsi" w:cstheme="majorHAnsi"/>
+          <w:i/>
+          <w:iCs/>
+        </w:rPr>
+        <w:t>2.</w:t>
+      </w:r>
+      <w:r>
+        <w:rPr>
+          <w:rFonts w:asciiTheme="majorHAnsi" w:hAnsiTheme="majorHAnsi" w:cstheme="majorHAnsi"/>
+          <w:i/>
+          <w:iCs/>
+        </w:rPr>
+        <w:t xml:space="preserve">  </w:t>
+      </w:r>
+      <w:r>
+        <w:rPr>
+          <w:rStyle w:val="Emphasis"/>
+          <w:rFonts w:asciiTheme="majorHAnsi" w:hAnsiTheme="majorHAnsi" w:cstheme="majorHAnsi"/>
+          <w:b/>
+          <w:bCs/>
+          <w:i w:val="0"/>
+          <w:iCs w:val="0"/>
+        </w:rPr>
+        <w:t>AI For India 2.0</w:t>
+      </w:r>
+      <w:r>
+        <w:rPr>
+          <w:rFonts w:asciiTheme="majorHAnsi" w:hAnsiTheme="majorHAnsi" w:cstheme="majorHAnsi"/>
+          <w:i/>
+          <w:iCs/>
+        </w:rPr>
+        <w:t xml:space="preserve"> – GUVI, 2023</w:t>
       </w:r>
     </w:p>
     <w:p>
       <w:pPr>
-        <w:pStyle w:val="ListBullet"/>
-        <w:spacing w:after="40"/>
+        <w:pStyle w:val="NormalWeb"/>
+        <w:spacing w:before="0" w:beforeAutospacing="0"/>
+        <w:rPr>
+          <w:rFonts w:asciiTheme="majorHAnsi" w:hAnsiTheme="majorHAnsi" w:cstheme="majorHAnsi"/>
+          <w:i/>
+          <w:iCs/>
+        </w:rPr>
       </w:pPr>
       <w:r>
-        <w:t>AI For India 2.0 – GUVI, 2023</w:t>
+        <w:rPr>
+          <w:rFonts w:asciiTheme="majorHAnsi" w:hAnsiTheme="majorHAnsi" w:cstheme="majorHAnsi"/>
+          <w:i/>
+          <w:iCs/>
+        </w:rPr>
+        <w:t xml:space="preserve">3. </w:t>
+      </w:r>
+      <w:r>
+        <w:rPr>
+          <w:rFonts w:asciiTheme="majorHAnsi" w:hAnsiTheme="majorHAnsi" w:cstheme="majorHAnsi"/>
+          <w:i/>
+          <w:iCs/>
+        </w:rPr>
+        <w:t xml:space="preserve"> </w:t>
+      </w:r>
+      <w:r>
+        <w:rPr>
+          <w:rStyle w:val="Emphasis"/>
+          <w:rFonts w:asciiTheme="majorHAnsi" w:hAnsiTheme="majorHAnsi" w:cstheme="majorHAnsi"/>
+          <w:b/>
+          <w:bCs/>
+          <w:i w:val="0"/>
+          <w:iCs w:val="0"/>
+        </w:rPr>
+        <w:t>The Complete Python Bootcamp</w:t>
+      </w:r>
+      <w:r>
+        <w:rPr>
+          <w:rStyle w:val="Emphasis"/>
+          <w:rFonts w:asciiTheme="majorHAnsi" w:hAnsiTheme="majorHAnsi" w:cstheme="majorHAnsi"/>
+          <w:i w:val="0"/>
+          <w:iCs w:val="0"/>
+        </w:rPr>
+        <w:t>: From Zero to Hero</w:t>
+      </w:r>
+      <w:r>
+        <w:rPr>
+          <w:rFonts w:asciiTheme="majorHAnsi" w:hAnsiTheme="majorHAnsi" w:cstheme="majorHAnsi"/>
+          <w:i/>
+          <w:iCs/>
+        </w:rPr>
+        <w:t xml:space="preserve"> – Udemy, 2023</w:t>
       </w:r>
     </w:p>
     <w:p>
       <w:pPr>
-        <w:pStyle w:val="ListBullet"/>
-        <w:spacing w:after="40"/>
+        <w:pStyle w:val="NormalWeb"/>
+        <w:spacing w:before="240" w:beforeAutospacing="0"/>
+        <w:rPr>
+          <w:rFonts w:asciiTheme="majorHAnsi" w:hAnsiTheme="majorHAnsi" w:cstheme="majorHAnsi"/>
+        </w:rPr>
       </w:pPr>
       <w:r>
-        <w:t>Review Paper Webinar</w:t>
+        <w:rPr>
+          <w:rFonts w:asciiTheme="majorHAnsi" w:hAnsiTheme="majorHAnsi" w:cstheme="majorHAnsi"/>
+        </w:rPr>
+        <w:t xml:space="preserve">4. </w:t>
       </w:r>
       <w:r>
-        <w:t xml:space="preserve"> Participation – Research </w:t>
+        <w:rPr>
+          <w:rFonts w:asciiTheme="majorHAnsi" w:hAnsiTheme="majorHAnsi" w:cstheme="majorHAnsi"/>
+        </w:rPr>
+        <w:t xml:space="preserve"> </w:t>
       </w:r>
-      <w:proofErr w:type="gramStart"/>
       <w:r>
-        <w:t>Graduate ,</w:t>
+        <w:rPr>
+          <w:rStyle w:val="Strong"/>
+          <w:rFonts w:asciiTheme="majorHAnsi" w:hAnsiTheme="majorHAnsi" w:cstheme="majorHAnsi"/>
+        </w:rPr>
+        <w:t>IBM Skills Network (Coursera)</w:t>
       </w:r>
-      <w:proofErr w:type="gramEnd"/>
       <w:r>
-        <w:t xml:space="preserve"> 2023</w:t>
+        <w:rPr>
+          <w:rFonts w:asciiTheme="majorHAnsi" w:hAnsiTheme="majorHAnsi" w:cstheme="majorHAnsi"/>
+        </w:rPr>
+        <w:t xml:space="preserve"> – 2025</w:t>
+      </w:r>
+    </w:p>
+    <w:p>
+      <w:pPr>
+        <w:pStyle w:val="NormalWeb"/>
+        <w:numPr>
+          <w:ilvl w:val="0"/>
+          <w:numId w:val="11"/>
+        </w:numPr>
+        <w:rPr>
+          <w:rFonts w:asciiTheme="majorHAnsi" w:hAnsiTheme="majorHAnsi" w:cstheme="majorHAnsi"/>
+        </w:rPr>
+      </w:pPr>
+      <w:r>
+        <w:rPr>
+          <w:rFonts w:asciiTheme="majorHAnsi" w:hAnsiTheme="majorHAnsi" w:cstheme="majorHAnsi"/>
+        </w:rPr>
+        <w:t>Introduction to Software Engineering</w:t>
+      </w:r>
+    </w:p>
+    <w:p>
+      <w:pPr>
+        <w:pStyle w:val="NormalWeb"/>
+        <w:numPr>
+          <w:ilvl w:val="0"/>
+          <w:numId w:val="11"/>
+        </w:numPr>
+        <w:rPr>
+          <w:rFonts w:asciiTheme="majorHAnsi" w:hAnsiTheme="majorHAnsi" w:cstheme="majorHAnsi"/>
+        </w:rPr>
+      </w:pPr>
+      <w:r>
+        <w:rPr>
+          <w:rFonts w:asciiTheme="majorHAnsi" w:hAnsiTheme="majorHAnsi" w:cstheme="majorHAnsi"/>
+        </w:rPr>
+        <w:t>Introduction to Cloud Computing</w:t>
+      </w:r>
+    </w:p>
+    <w:p>
+      <w:pPr>
+        <w:pStyle w:val="NormalWeb"/>
+        <w:numPr>
+          <w:ilvl w:val="0"/>
+          <w:numId w:val="11"/>
+        </w:numPr>
+        <w:rPr>
+          <w:rFonts w:asciiTheme="majorHAnsi" w:hAnsiTheme="majorHAnsi" w:cstheme="majorHAnsi"/>
+        </w:rPr>
+      </w:pPr>
+      <w:r>
+        <w:rPr>
+          <w:rFonts w:asciiTheme="majorHAnsi" w:hAnsiTheme="majorHAnsi" w:cstheme="majorHAnsi"/>
+        </w:rPr>
+        <w:t>Introduction to HTML, CSS &amp; JavaScript</w:t>
+      </w:r>
+    </w:p>
+    <w:p>
+      <w:pPr>
+        <w:pStyle w:val="NormalWeb"/>
+        <w:numPr>
+          <w:ilvl w:val="0"/>
+          <w:numId w:val="11"/>
+        </w:numPr>
+        <w:rPr>
+          <w:rFonts w:asciiTheme="majorHAnsi" w:hAnsiTheme="majorHAnsi" w:cstheme="majorHAnsi"/>
+        </w:rPr>
+      </w:pPr>
+      <w:r>
+        <w:rPr>
+          <w:rFonts w:asciiTheme="majorHAnsi" w:hAnsiTheme="majorHAnsi" w:cstheme="majorHAnsi"/>
+        </w:rPr>
+        <w:t>Getting Started with Git &amp; GitHub</w:t>
+      </w:r>
+    </w:p>
+    <w:p>
+      <w:pPr>
+        <w:pStyle w:val="NormalWeb"/>
+        <w:numPr>
+          <w:ilvl w:val="0"/>
+          <w:numId w:val="11"/>
+        </w:numPr>
+        <w:rPr>
+          <w:rFonts w:asciiTheme="majorHAnsi" w:hAnsiTheme="majorHAnsi" w:cstheme="majorHAnsi"/>
+        </w:rPr>
+      </w:pPr>
+      <w:r>
+        <w:rPr>
+          <w:rFonts w:asciiTheme="majorHAnsi" w:hAnsiTheme="majorHAnsi" w:cstheme="majorHAnsi"/>
+        </w:rPr>
+        <w:t>Developing Front-End Apps with React</w:t>
+      </w:r>
+    </w:p>
+    <w:p>
+      <w:pPr>
+        <w:pStyle w:val="NormalWeb"/>
+        <w:numPr>
+          <w:ilvl w:val="0"/>
+          <w:numId w:val="11"/>
+        </w:numPr>
+        <w:rPr>
+          <w:rFonts w:asciiTheme="majorHAnsi" w:hAnsiTheme="majorHAnsi" w:cstheme="majorHAnsi"/>
+        </w:rPr>
+      </w:pPr>
+      <w:r>
+        <w:rPr>
+          <w:rFonts w:asciiTheme="majorHAnsi" w:hAnsiTheme="majorHAnsi" w:cstheme="majorHAnsi"/>
+        </w:rPr>
+        <w:t>Developing Back-End Apps with Node.js &amp; Express</w:t>
+      </w:r>
+    </w:p>
+    <w:p>
+      <w:pPr>
+        <w:pStyle w:val="NormalWeb"/>
+        <w:numPr>
+          <w:ilvl w:val="0"/>
+          <w:numId w:val="11"/>
+        </w:numPr>
+        <w:rPr>
+          <w:rFonts w:asciiTheme="majorHAnsi" w:hAnsiTheme="majorHAnsi" w:cstheme="majorHAnsi"/>
+        </w:rPr>
+      </w:pPr>
+      <w:r>
+        <w:rPr>
+          <w:rFonts w:asciiTheme="majorHAnsi" w:hAnsiTheme="majorHAnsi" w:cstheme="majorHAnsi"/>
+        </w:rPr>
+        <w:t>Python for Data Science, AI &amp; Development</w:t>
+      </w:r>
+    </w:p>
+    <w:p>
+      <w:pPr>
+        <w:pStyle w:val="NormalWeb"/>
+        <w:numPr>
+          <w:ilvl w:val="0"/>
+          <w:numId w:val="11"/>
+        </w:numPr>
+        <w:rPr>
+          <w:rFonts w:asciiTheme="majorHAnsi" w:hAnsiTheme="majorHAnsi" w:cstheme="majorHAnsi"/>
+        </w:rPr>
+      </w:pPr>
+      <w:r>
+        <w:rPr>
+          <w:rFonts w:asciiTheme="majorHAnsi" w:hAnsiTheme="majorHAnsi" w:cstheme="majorHAnsi"/>
+        </w:rPr>
+        <w:t>Developing AI Applications with Python &amp; Flask</w:t>
+      </w:r>
+    </w:p>
+    <w:p>
+      <w:pPr>
+        <w:pStyle w:val="NormalWeb"/>
+        <w:numPr>
+          <w:ilvl w:val="0"/>
+          <w:numId w:val="11"/>
+        </w:numPr>
+        <w:rPr>
+          <w:rFonts w:asciiTheme="majorHAnsi" w:hAnsiTheme="majorHAnsi" w:cstheme="majorHAnsi"/>
+        </w:rPr>
+      </w:pPr>
+      <w:r>
+        <w:rPr>
+          <w:rFonts w:asciiTheme="majorHAnsi" w:hAnsiTheme="majorHAnsi" w:cstheme="majorHAnsi"/>
+        </w:rPr>
+        <w:t>Django Application Development with SQL &amp; Databases</w:t>
       </w:r>
     </w:p>
     <w:p>
@@ -563,7 +1316,7 @@
         <w:spacing w:after="40"/>
       </w:pPr>
       <w:r>
-        <w:t>Core member of Visionary Club – A college tech and innovation group.</w:t>
+        <w:t>Ex-Core member of Visionary Club – A college tech and innovation group.</w:t>
       </w:r>
     </w:p>
     <w:sectPr>
@@ -731,7 +1484,7 @@
   <w:abstractNum w:abstractNumId="8" w15:restartNumberingAfterBreak="0">
     <w:nsid w:val="FFFFFF89"/>
     <w:multiLevelType w:val="singleLevel"/>
-    <w:tmpl w:val="29761A62"/>
+    <w:tmpl w:val="07A83BE6"/>
     <w:lvl w:ilvl="0">
       <w:start w:val="1"/>
       <w:numFmt w:val="bullet"/>
@@ -750,6 +1503,155 @@
     </w:lvl>
   </w:abstractNum>
   <w:abstractNum w:abstractNumId="9" w15:restartNumberingAfterBreak="0">
+    <w:nsid w:val="06494F74"/>
+    <w:multiLevelType w:val="multilevel"/>
+    <w:tmpl w:val="938AC300"/>
+    <w:lvl w:ilvl="0">
+      <w:start w:val="1"/>
+      <w:numFmt w:val="bullet"/>
+      <w:lvlText w:val=""/>
+      <w:lvlJc w:val="left"/>
+      <w:pPr>
+        <w:tabs>
+          <w:tab w:val="num" w:pos="720"/>
+        </w:tabs>
+        <w:ind w:left="720" w:hanging="360"/>
+      </w:pPr>
+      <w:rPr>
+        <w:rFonts w:ascii="Symbol" w:hAnsi="Symbol" w:hint="default"/>
+        <w:sz w:val="20"/>
+      </w:rPr>
+    </w:lvl>
+    <w:lvl w:ilvl="1" w:tentative="1">
+      <w:start w:val="1"/>
+      <w:numFmt w:val="bullet"/>
+      <w:lvlText w:val="o"/>
+      <w:lvlJc w:val="left"/>
+      <w:pPr>
+        <w:tabs>
+          <w:tab w:val="num" w:pos="1440"/>
+        </w:tabs>
+        <w:ind w:left="1440" w:hanging="360"/>
+      </w:pPr>
+      <w:rPr>
+        <w:rFonts w:ascii="Courier New" w:hAnsi="Courier New" w:hint="default"/>
+        <w:sz w:val="20"/>
+      </w:rPr>
+    </w:lvl>
+    <w:lvl w:ilvl="2" w:tentative="1">
+      <w:start w:val="1"/>
+      <w:numFmt w:val="bullet"/>
+      <w:lvlText w:val=""/>
+      <w:lvlJc w:val="left"/>
+      <w:pPr>
+        <w:tabs>
+          <w:tab w:val="num" w:pos="2160"/>
+        </w:tabs>
+        <w:ind w:left="2160" w:hanging="360"/>
+      </w:pPr>
+      <w:rPr>
+        <w:rFonts w:ascii="Wingdings" w:hAnsi="Wingdings" w:hint="default"/>
+        <w:sz w:val="20"/>
+      </w:rPr>
+    </w:lvl>
+    <w:lvl w:ilvl="3" w:tentative="1">
+      <w:start w:val="1"/>
+      <w:numFmt w:val="bullet"/>
+      <w:lvlText w:val=""/>
+      <w:lvlJc w:val="left"/>
+      <w:pPr>
+        <w:tabs>
+          <w:tab w:val="num" w:pos="2880"/>
+        </w:tabs>
+        <w:ind w:left="2880" w:hanging="360"/>
+      </w:pPr>
+      <w:rPr>
+        <w:rFonts w:ascii="Wingdings" w:hAnsi="Wingdings" w:hint="default"/>
+        <w:sz w:val="20"/>
+      </w:rPr>
+    </w:lvl>
+    <w:lvl w:ilvl="4" w:tentative="1">
+      <w:start w:val="1"/>
+      <w:numFmt w:val="bullet"/>
+      <w:lvlText w:val=""/>
+      <w:lvlJc w:val="left"/>
+      <w:pPr>
+        <w:tabs>
+          <w:tab w:val="num" w:pos="3600"/>
+        </w:tabs>
+        <w:ind w:left="3600" w:hanging="360"/>
+      </w:pPr>
+      <w:rPr>
+        <w:rFonts w:ascii="Wingdings" w:hAnsi="Wingdings" w:hint="default"/>
+        <w:sz w:val="20"/>
+      </w:rPr>
+    </w:lvl>
+    <w:lvl w:ilvl="5" w:tentative="1">
+      <w:start w:val="1"/>
+      <w:numFmt w:val="bullet"/>
+      <w:lvlText w:val=""/>
+      <w:lvlJc w:val="left"/>
+      <w:pPr>
+        <w:tabs>
+          <w:tab w:val="num" w:pos="4320"/>
+        </w:tabs>
+        <w:ind w:left="4320" w:hanging="360"/>
+      </w:pPr>
+      <w:rPr>
+        <w:rFonts w:ascii="Wingdings" w:hAnsi="Wingdings" w:hint="default"/>
+        <w:sz w:val="20"/>
+      </w:rPr>
+    </w:lvl>
+    <w:lvl w:ilvl="6" w:tentative="1">
+      <w:start w:val="1"/>
+      <w:numFmt w:val="bullet"/>
+      <w:lvlText w:val=""/>
+      <w:lvlJc w:val="left"/>
+      <w:pPr>
+        <w:tabs>
+          <w:tab w:val="num" w:pos="5040"/>
+        </w:tabs>
+        <w:ind w:left="5040" w:hanging="360"/>
+      </w:pPr>
+      <w:rPr>
+        <w:rFonts w:ascii="Wingdings" w:hAnsi="Wingdings" w:hint="default"/>
+        <w:sz w:val="20"/>
+      </w:rPr>
+    </w:lvl>
+    <w:lvl w:ilvl="7" w:tentative="1">
+      <w:start w:val="1"/>
+      <w:numFmt w:val="bullet"/>
+      <w:lvlText w:val=""/>
+      <w:lvlJc w:val="left"/>
+      <w:pPr>
+        <w:tabs>
+          <w:tab w:val="num" w:pos="5760"/>
+        </w:tabs>
+        <w:ind w:left="5760" w:hanging="360"/>
+      </w:pPr>
+      <w:rPr>
+        <w:rFonts w:ascii="Wingdings" w:hAnsi="Wingdings" w:hint="default"/>
+        <w:sz w:val="20"/>
+      </w:rPr>
+    </w:lvl>
+    <w:lvl w:ilvl="8" w:tentative="1">
+      <w:start w:val="1"/>
+      <w:numFmt w:val="bullet"/>
+      <w:lvlText w:val=""/>
+      <w:lvlJc w:val="left"/>
+      <w:pPr>
+        <w:tabs>
+          <w:tab w:val="num" w:pos="6480"/>
+        </w:tabs>
+        <w:ind w:left="6480" w:hanging="360"/>
+      </w:pPr>
+      <w:rPr>
+        <w:rFonts w:ascii="Wingdings" w:hAnsi="Wingdings" w:hint="default"/>
+        <w:sz w:val="20"/>
+      </w:rPr>
+    </w:lvl>
+  </w:abstractNum>
+  <w:abstractNum w:abstractNumId="10" w15:restartNumberingAfterBreak="0">
     <w:nsid w:val="1CD14672"/>
     <w:multiLevelType w:val="multilevel"/>
     <w:tmpl w:val="9A04391A"/>
@@ -895,6 +1797,119 @@
       <w:rPr>
         <w:rFonts w:ascii="Wingdings" w:hAnsi="Wingdings" w:hint="default"/>
         <w:sz w:val="20"/>
+      </w:rPr>
+    </w:lvl>
+  </w:abstractNum>
+  <w:abstractNum w:abstractNumId="11" w15:restartNumberingAfterBreak="0">
+    <w:nsid w:val="3F090CA3"/>
+    <w:multiLevelType w:val="hybridMultilevel"/>
+    <w:tmpl w:val="D932F2F6"/>
+    <w:lvl w:ilvl="0" w:tplc="40090003">
+      <w:start w:val="1"/>
+      <w:numFmt w:val="bullet"/>
+      <w:lvlText w:val="o"/>
+      <w:lvlJc w:val="left"/>
+      <w:pPr>
+        <w:ind w:left="720" w:hanging="360"/>
+      </w:pPr>
+      <w:rPr>
+        <w:rFonts w:ascii="Courier New" w:hAnsi="Courier New" w:cs="Courier New" w:hint="default"/>
+      </w:rPr>
+    </w:lvl>
+    <w:lvl w:ilvl="1" w:tplc="40090003" w:tentative="1">
+      <w:start w:val="1"/>
+      <w:numFmt w:val="bullet"/>
+      <w:lvlText w:val="o"/>
+      <w:lvlJc w:val="left"/>
+      <w:pPr>
+        <w:ind w:left="1440" w:hanging="360"/>
+      </w:pPr>
+      <w:rPr>
+        <w:rFonts w:ascii="Courier New" w:hAnsi="Courier New" w:cs="Courier New" w:hint="default"/>
+      </w:rPr>
+    </w:lvl>
+    <w:lvl w:ilvl="2" w:tplc="40090005" w:tentative="1">
+      <w:start w:val="1"/>
+      <w:numFmt w:val="bullet"/>
+      <w:lvlText w:val=""/>
+      <w:lvlJc w:val="left"/>
+      <w:pPr>
+        <w:ind w:left="2160" w:hanging="360"/>
+      </w:pPr>
+      <w:rPr>
+        <w:rFonts w:ascii="Wingdings" w:hAnsi="Wingdings" w:hint="default"/>
+      </w:rPr>
+    </w:lvl>
+    <w:lvl w:ilvl="3" w:tplc="40090001" w:tentative="1">
+      <w:start w:val="1"/>
+      <w:numFmt w:val="bullet"/>
+      <w:lvlText w:val=""/>
+      <w:lvlJc w:val="left"/>
+      <w:pPr>
+        <w:ind w:left="2880" w:hanging="360"/>
+      </w:pPr>
+      <w:rPr>
+        <w:rFonts w:ascii="Symbol" w:hAnsi="Symbol" w:hint="default"/>
+      </w:rPr>
+    </w:lvl>
+    <w:lvl w:ilvl="4" w:tplc="40090003" w:tentative="1">
+      <w:start w:val="1"/>
+      <w:numFmt w:val="bullet"/>
+      <w:lvlText w:val="o"/>
+      <w:lvlJc w:val="left"/>
+      <w:pPr>
+        <w:ind w:left="3600" w:hanging="360"/>
+      </w:pPr>
+      <w:rPr>
+        <w:rFonts w:ascii="Courier New" w:hAnsi="Courier New" w:cs="Courier New" w:hint="default"/>
+      </w:rPr>
+    </w:lvl>
+    <w:lvl w:ilvl="5" w:tplc="40090005" w:tentative="1">
+      <w:start w:val="1"/>
+      <w:numFmt w:val="bullet"/>
+      <w:lvlText w:val=""/>
+      <w:lvlJc w:val="left"/>
+      <w:pPr>
+        <w:ind w:left="4320" w:hanging="360"/>
+      </w:pPr>
+      <w:rPr>
+        <w:rFonts w:ascii="Wingdings" w:hAnsi="Wingdings" w:hint="default"/>
+      </w:rPr>
+    </w:lvl>
+    <w:lvl w:ilvl="6" w:tplc="40090001" w:tentative="1">
+      <w:start w:val="1"/>
+      <w:numFmt w:val="bullet"/>
+      <w:lvlText w:val=""/>
+      <w:lvlJc w:val="left"/>
+      <w:pPr>
+        <w:ind w:left="5040" w:hanging="360"/>
+      </w:pPr>
+      <w:rPr>
+        <w:rFonts w:ascii="Symbol" w:hAnsi="Symbol" w:hint="default"/>
+      </w:rPr>
+    </w:lvl>
+    <w:lvl w:ilvl="7" w:tplc="40090003" w:tentative="1">
+      <w:start w:val="1"/>
+      <w:numFmt w:val="bullet"/>
+      <w:lvlText w:val="o"/>
+      <w:lvlJc w:val="left"/>
+      <w:pPr>
+        <w:ind w:left="5760" w:hanging="360"/>
+      </w:pPr>
+      <w:rPr>
+        <w:rFonts w:ascii="Courier New" w:hAnsi="Courier New" w:cs="Courier New" w:hint="default"/>
+      </w:rPr>
+    </w:lvl>
+    <w:lvl w:ilvl="8" w:tplc="40090005" w:tentative="1">
+      <w:start w:val="1"/>
+      <w:numFmt w:val="bullet"/>
+      <w:lvlText w:val=""/>
+      <w:lvlJc w:val="left"/>
+      <w:pPr>
+        <w:ind w:left="6480" w:hanging="360"/>
+      </w:pPr>
+      <w:rPr>
+        <w:rFonts w:ascii="Wingdings" w:hAnsi="Wingdings" w:hint="default"/>
       </w:rPr>
     </w:lvl>
   </w:abstractNum>
@@ -926,7 +1941,13 @@
     <w:abstractNumId w:val="0"/>
   </w:num>
   <w:num w:numId="10" w16cid:durableId="2032141293">
+    <w:abstractNumId w:val="10"/>
+  </w:num>
+  <w:num w:numId="11" w16cid:durableId="979531134">
     <w:abstractNumId w:val="9"/>
+  </w:num>
+  <w:num w:numId="12" w16cid:durableId="1477186875">
+    <w:abstractNumId w:val="11"/>
   </w:num>
 </w:numbering>
 </file>
@@ -1537,6 +2558,7 @@
   <w:style w:type="character" w:default="1" w:styleId="DefaultParagraphFont">
     <w:name w:val="Default Paragraph Font"/>
     <w:uiPriority w:val="1"/>
+    <w:semiHidden/>
     <w:unhideWhenUsed/>
   </w:style>
   <w:style w:type="table" w:default="1" w:styleId="TableNormal">
@@ -12334,6 +13356,23 @@
     <w:rPr>
       <w:color w:val="605E5C"/>
       <w:shd w:val="clear" w:color="auto" w:fill="E1DFDD"/>
+    </w:rPr>
+  </w:style>
+  <w:style w:type="paragraph" w:styleId="NormalWeb">
+    <w:name w:val="Normal (Web)"/>
+    <w:basedOn w:val="Normal"/>
+    <w:uiPriority w:val="99"/>
+    <w:semiHidden/>
+    <w:unhideWhenUsed/>
+    <w:rsid w:val="0002292E"/>
+    <w:pPr>
+      <w:spacing w:before="100" w:beforeAutospacing="1" w:after="100" w:afterAutospacing="1" w:line="240" w:lineRule="auto"/>
+    </w:pPr>
+    <w:rPr>
+      <w:rFonts w:ascii="Times New Roman" w:eastAsia="Times New Roman" w:hAnsi="Times New Roman" w:cs="Times New Roman"/>
+      <w:sz w:val="24"/>
+      <w:szCs w:val="24"/>
+      <w:lang w:val="en-IN" w:eastAsia="en-IN"/>
     </w:rPr>
   </w:style>
 </w:styles>

</xml_diff>